<commit_message>
Fix US template alignment
</commit_message>
<xml_diff>
--- a/templates/ford-us-resume-template.docx
+++ b/templates/ford-us-resume-template.docx
@@ -31,6 +31,7 @@
     </w:p>
     <w:p>
       <w:pPr>
+        <w:widowControl w:val="0"/>
         <w:pBdr>
           <w:bottom w:color="000000" w:space="1" w:sz="4" w:val="single"/>
         </w:pBdr>
@@ -46,6 +47,17 @@
       </w:pPr>
       <w:r>
         <w:rPr>
+          <w:rFonts w:ascii="Times New Roman" w:cs="Times New Roman" w:eastAsia="Times New Roman" w:hAnsi="Times New Roman"/>
+          <w:b w:val="1"/>
+          <w:bCs w:val="1"/>
+          <w:sz w:val="24"/>
+          <w:szCs w:val="24"/>
+          <w:rtl w:val="0"/>
+        </w:rPr>
+        <w:t xml:space="preserve"> ({{designation}})</w:t>
+      </w:r>
+      <w:r>
+        <w:rPr>
           <w:rtl w:val="0"/>
         </w:rPr>
       </w:r>
@@ -86,47 +98,81 @@
     </w:p>
     <w:p>
       <w:pPr>
-        <w:keepNext w:val="0"/>
-        <w:keepLines w:val="0"/>
-        <w:pageBreakBefore w:val="0"/>
-        <w:widowControl w:val="1"/>
+        <w:spacing w:after="0" w:line="276" w:lineRule="auto"/>
+        <w:jc w:val="both"/>
+        <w:rPr>
+          <w:rFonts w:ascii="Times New Roman" w:cs="Times New Roman" w:eastAsia="Times New Roman" w:hAnsi="Times New Roman"/>
+          <w:sz w:val="24"/>
+          <w:szCs w:val="24"/>
+        </w:rPr>
+      </w:pPr>
+      <w:r>
+        <w:rPr>
+          <w:rFonts w:ascii="Times New Roman" w:cs="Times New Roman" w:eastAsia="Times New Roman" w:hAnsi="Times New Roman"/>
+          <w:sz w:val="24"/>
+          <w:szCs w:val="24"/>
+          <w:rtl w:val="0"/>
+        </w:rPr>
+        <w:t xml:space="preserve">{%- for csum in career_summary %}</w:t>
+      </w:r>
+    </w:p>
+    <w:p>
+      <w:pPr>
+        <w:spacing w:after="0" w:line="276" w:lineRule="auto"/>
+        <w:jc w:val="both"/>
+        <w:rPr>
+          <w:rFonts w:ascii="Times New Roman" w:cs="Times New Roman" w:eastAsia="Times New Roman" w:hAnsi="Times New Roman"/>
+          <w:sz w:val="24"/>
+          <w:szCs w:val="24"/>
+        </w:rPr>
+      </w:pPr>
+      <w:r>
+        <w:rPr>
+          <w:rtl w:val="0"/>
+        </w:rPr>
+      </w:r>
+    </w:p>
+    <w:p>
+      <w:pPr>
         <w:numPr>
           <w:ilvl w:val="0"/>
           <w:numId w:val="1"/>
         </w:numPr>
-        <w:pBdr>
-          <w:top w:space="0" w:sz="0" w:val="nil"/>
-          <w:left w:space="0" w:sz="0" w:val="nil"/>
-          <w:bottom w:space="0" w:sz="0" w:val="nil"/>
-          <w:right w:space="0" w:sz="0" w:val="nil"/>
-          <w:between w:space="0" w:sz="0" w:val="nil"/>
-        </w:pBdr>
-        <w:shd w:fill="auto" w:val="clear"/>
-        <w:spacing w:after="0" w:before="0" w:line="240" w:lineRule="auto"/>
-        <w:ind w:left="360" w:right="0" w:hanging="360"/>
-        <w:jc w:val="both"/>
-        <w:rPr>
-          <w:rFonts w:ascii="Times New Roman" w:cs="Times New Roman" w:eastAsia="Times New Roman" w:hAnsi="Times New Roman"/>
-          <w:b w:val="0"/>
-          <w:bCs w:val="0"/>
-          <w:i w:val="0"/>
-          <w:iCs w:val="0"/>
-          <w:smallCaps w:val="0"/>
-          <w:strike w:val="0"/>
-          <w:color w:val="000000"/>
-          <w:sz w:val="22"/>
-          <w:szCs w:val="22"/>
-          <w:u w:val="none"/>
-          <w:shd w:fill="auto" w:val="clear"/>
-          <w:vertAlign w:val="baseline"/>
-        </w:rPr>
-      </w:pPr>
-      <w:r>
-        <w:rPr>
-          <w:rFonts w:ascii="Times New Roman" w:cs="Times New Roman" w:eastAsia="Times New Roman" w:hAnsi="Times New Roman"/>
-          <w:rtl w:val="0"/>
-        </w:rPr>
-        <w:t xml:space="preserve">{{summary}}</w:t>
+        <w:spacing w:after="0" w:line="276" w:lineRule="auto"/>
+        <w:ind w:left="360"/>
+        <w:jc w:val="both"/>
+        <w:rPr>
+          <w:rFonts w:ascii="Times New Roman" w:cs="Times New Roman" w:eastAsia="Times New Roman" w:hAnsi="Times New Roman"/>
+          <w:sz w:val="24"/>
+          <w:szCs w:val="24"/>
+        </w:rPr>
+      </w:pPr>
+      <w:r>
+        <w:rPr>
+          <w:rFonts w:ascii="Times New Roman" w:cs="Times New Roman" w:eastAsia="Times New Roman" w:hAnsi="Times New Roman"/>
+          <w:sz w:val="24"/>
+          <w:szCs w:val="24"/>
+          <w:rtl w:val="0"/>
+        </w:rPr>
+        <w:t xml:space="preserve">{{csum}}</w:t>
+      </w:r>
+    </w:p>
+    <w:p>
+      <w:pPr>
+        <w:spacing w:after="0" w:line="276" w:lineRule="auto"/>
+        <w:jc w:val="both"/>
+        <w:rPr>
+          <w:rFonts w:ascii="Times New Roman" w:cs="Times New Roman" w:eastAsia="Times New Roman" w:hAnsi="Times New Roman"/>
+        </w:rPr>
+      </w:pPr>
+      <w:r>
+        <w:rPr>
+          <w:rFonts w:ascii="Times New Roman" w:cs="Times New Roman" w:eastAsia="Times New Roman" w:hAnsi="Times New Roman"/>
+          <w:sz w:val="24"/>
+          <w:szCs w:val="24"/>
+          <w:rtl w:val="0"/>
+        </w:rPr>
+        <w:t xml:space="preserve">{%- endfor %}</w:t>
       </w:r>
       <w:r>
         <w:rPr>
@@ -186,6 +232,15 @@
           <w:rFonts w:ascii="Times New Roman" w:cs="Times New Roman" w:eastAsia="Times New Roman" w:hAnsi="Times New Roman"/>
           <w:b w:val="1"/>
           <w:bCs w:val="1"/>
+          <w:sz w:val="24"/>
+          <w:szCs w:val="24"/>
+        </w:rPr>
+      </w:pPr>
+      <w:r>
+        <w:rPr>
+          <w:rFonts w:ascii="Times New Roman" w:cs="Times New Roman" w:eastAsia="Times New Roman" w:hAnsi="Times New Roman"/>
+          <w:b w:val="1"/>
+          <w:bCs w:val="1"/>
           <w:i w:val="0"/>
           <w:iCs w:val="0"/>
           <w:smallCaps w:val="0"/>
@@ -196,31 +251,35 @@
           <w:u w:val="none"/>
           <w:shd w:fill="auto" w:val="clear"/>
           <w:vertAlign w:val="baseline"/>
-        </w:rPr>
-      </w:pPr>
-      <w:r>
-        <w:rPr>
-          <w:rFonts w:ascii="Times New Roman" w:cs="Times New Roman" w:eastAsia="Times New Roman" w:hAnsi="Times New Roman"/>
-          <w:b w:val="1"/>
-          <w:bCs w:val="1"/>
-          <w:i w:val="0"/>
-          <w:iCs w:val="0"/>
-          <w:smallCaps w:val="0"/>
-          <w:strike w:val="0"/>
-          <w:color w:val="000000"/>
-          <w:sz w:val="24"/>
-          <w:szCs w:val="24"/>
-          <w:u w:val="none"/>
-          <w:shd w:fill="auto" w:val="clear"/>
-          <w:vertAlign w:val="baseline"/>
           <w:rtl w:val="0"/>
         </w:rPr>
         <w:t xml:space="preserve">Technical Skills:</w:t>
       </w:r>
-    </w:p>
-    <w:p>
-      <w:pPr>
-        <w:spacing w:after="0" w:line="240" w:lineRule="auto"/>
+      <w:r>
+        <w:rPr>
+          <w:rtl w:val="0"/>
+        </w:rPr>
+      </w:r>
+    </w:p>
+    <w:p>
+      <w:pPr>
+        <w:keepNext w:val="0"/>
+        <w:keepLines w:val="0"/>
+        <w:pageBreakBefore w:val="0"/>
+        <w:widowControl w:val="1"/>
+        <w:pBdr>
+          <w:top w:space="0" w:sz="0" w:val="nil"/>
+          <w:left w:space="0" w:sz="0" w:val="nil"/>
+          <w:bottom w:space="0" w:sz="0" w:val="nil"/>
+          <w:right w:space="0" w:sz="0" w:val="nil"/>
+          <w:between w:space="0" w:sz="0" w:val="nil"/>
+        </w:pBdr>
+        <w:shd w:fill="auto" w:val="clear"/>
+        <w:tabs>
+          <w:tab w:val="left" w:leader="none" w:pos="360"/>
+        </w:tabs>
+        <w:spacing w:after="0" w:before="0" w:line="240" w:lineRule="auto"/>
+        <w:ind w:left="0" w:right="0" w:firstLine="0"/>
         <w:jc w:val="both"/>
         <w:rPr>
           <w:rFonts w:ascii="Times New Roman" w:cs="Times New Roman" w:eastAsia="Times New Roman" w:hAnsi="Times New Roman"/>
@@ -254,6 +313,22 @@
           <w:rtl w:val="0"/>
         </w:rPr>
         <w:t xml:space="preserve">{%- for skill in skills %}</w:t>
+      </w:r>
+    </w:p>
+    <w:p>
+      <w:pPr>
+        <w:spacing w:after="0" w:line="240" w:lineRule="auto"/>
+        <w:jc w:val="both"/>
+        <w:rPr>
+          <w:rFonts w:ascii="Times New Roman" w:cs="Times New Roman" w:eastAsia="Times New Roman" w:hAnsi="Times New Roman"/>
+          <w:sz w:val="24"/>
+          <w:szCs w:val="24"/>
+        </w:rPr>
+      </w:pPr>
+      <w:r>
+        <w:rPr>
+          <w:rtl w:val="0"/>
+        </w:rPr>
       </w:r>
     </w:p>
     <w:p>
@@ -371,7 +446,7 @@
           <w:color w:val="000000"/>
           <w:sz w:val="24"/>
           <w:szCs w:val="24"/>
-          <w:u w:val="single"/>
+          <w:u w:val="none"/>
           <w:shd w:fill="auto" w:val="clear"/>
           <w:vertAlign w:val="baseline"/>
         </w:rPr>
@@ -395,6 +470,261 @@
         </w:rPr>
         <w:t xml:space="preserve">Professional Experience:</w:t>
       </w:r>
+    </w:p>
+    <w:p>
+      <w:pPr>
+        <w:keepNext w:val="0"/>
+        <w:keepLines w:val="0"/>
+        <w:pageBreakBefore w:val="0"/>
+        <w:widowControl w:val="1"/>
+        <w:pBdr>
+          <w:top w:space="0" w:sz="0" w:val="nil"/>
+          <w:left w:space="0" w:sz="0" w:val="nil"/>
+          <w:bottom w:space="0" w:sz="0" w:val="nil"/>
+          <w:right w:space="0" w:sz="0" w:val="nil"/>
+          <w:between w:space="0" w:sz="0" w:val="nil"/>
+        </w:pBdr>
+        <w:shd w:fill="auto" w:val="clear"/>
+        <w:spacing w:after="0" w:before="0" w:line="240" w:lineRule="auto"/>
+        <w:ind w:left="0" w:right="0" w:firstLine="0"/>
+        <w:jc w:val="left"/>
+        <w:rPr>
+          <w:rFonts w:ascii="Times New Roman" w:cs="Times New Roman" w:eastAsia="Times New Roman" w:hAnsi="Times New Roman"/>
+          <w:b w:val="1"/>
+          <w:bCs w:val="1"/>
+          <w:i w:val="0"/>
+          <w:iCs w:val="0"/>
+          <w:smallCaps w:val="0"/>
+          <w:strike w:val="0"/>
+          <w:color w:val="000000"/>
+          <w:sz w:val="22"/>
+          <w:szCs w:val="22"/>
+          <w:u w:val="single"/>
+          <w:shd w:fill="auto" w:val="clear"/>
+          <w:vertAlign w:val="baseline"/>
+        </w:rPr>
+      </w:pPr>
+      <w:r>
+        <w:rPr>
+          <w:rtl w:val="0"/>
+        </w:rPr>
+      </w:r>
+    </w:p>
+    <w:p>
+      <w:pPr>
+        <w:spacing w:after="0" w:line="240" w:lineRule="auto"/>
+        <w:ind w:left="0" w:firstLine="0"/>
+        <w:jc w:val="both"/>
+        <w:rPr>
+          <w:rFonts w:ascii="Times New Roman" w:cs="Times New Roman" w:eastAsia="Times New Roman" w:hAnsi="Times New Roman"/>
+        </w:rPr>
+      </w:pPr>
+      <w:r>
+        <w:rPr>
+          <w:rFonts w:ascii="Times New Roman" w:cs="Times New Roman" w:eastAsia="Times New Roman" w:hAnsi="Times New Roman"/>
+          <w:rtl w:val="0"/>
+        </w:rPr>
+        <w:t xml:space="preserve">{%- for exp in experience %}</w:t>
+      </w:r>
+    </w:p>
+    <w:p>
+      <w:pPr>
+        <w:spacing w:after="0" w:line="240" w:lineRule="auto"/>
+        <w:ind w:left="0" w:firstLine="0"/>
+        <w:jc w:val="both"/>
+        <w:rPr>
+          <w:rFonts w:ascii="Times New Roman" w:cs="Times New Roman" w:eastAsia="Times New Roman" w:hAnsi="Times New Roman"/>
+        </w:rPr>
+      </w:pPr>
+      <w:r>
+        <w:rPr>
+          <w:rtl w:val="0"/>
+        </w:rPr>
+      </w:r>
+    </w:p>
+    <w:p>
+      <w:pPr>
+        <w:spacing w:after="0" w:line="240" w:lineRule="auto"/>
+        <w:ind w:left="0" w:right="-1410" w:firstLine="0"/>
+        <w:jc w:val="both"/>
+        <w:rPr>
+          <w:rFonts w:ascii="Times New Roman" w:cs="Times New Roman" w:eastAsia="Times New Roman" w:hAnsi="Times New Roman"/>
+          <w:b w:val="1"/>
+          <w:bCs w:val="1"/>
+        </w:rPr>
+      </w:pPr>
+      <w:r>
+        <w:rPr>
+          <w:rFonts w:ascii="Times New Roman" w:cs="Times New Roman" w:eastAsia="Times New Roman" w:hAnsi="Times New Roman"/>
+          <w:b w:val="1"/>
+          <w:bCs w:val="1"/>
+          <w:rtl w:val="0"/>
+        </w:rPr>
+        <w:t xml:space="preserve">Client: </w:t>
+      </w:r>
+      <w:r>
+        <w:rPr>
+          <w:rFonts w:ascii="Times New Roman" w:cs="Times New Roman" w:eastAsia="Times New Roman" w:hAnsi="Times New Roman"/>
+          <w:rtl w:val="0"/>
+        </w:rPr>
+        <w:t xml:space="preserve">{{exp.company}}                    </w:t>
+        <w:tab/>
+        <w:tab/>
+        <w:tab/>
+        <w:tab/>
+        <w:t xml:space="preserve">          {{exp.start_date}}-{{exp.end_date}}</w:t>
+        <w:tab/>
+      </w:r>
+      <w:r>
+        <w:rPr>
+          <w:rtl w:val="0"/>
+        </w:rPr>
+      </w:r>
+    </w:p>
+    <w:p>
+      <w:pPr>
+        <w:spacing w:after="0" w:line="240" w:lineRule="auto"/>
+        <w:ind w:left="0" w:firstLine="0"/>
+        <w:jc w:val="both"/>
+        <w:rPr>
+          <w:rFonts w:ascii="Times New Roman" w:cs="Times New Roman" w:eastAsia="Times New Roman" w:hAnsi="Times New Roman"/>
+        </w:rPr>
+      </w:pPr>
+      <w:r>
+        <w:rPr>
+          <w:rFonts w:ascii="Times New Roman" w:cs="Times New Roman" w:eastAsia="Times New Roman" w:hAnsi="Times New Roman"/>
+          <w:b w:val="1"/>
+          <w:bCs w:val="1"/>
+          <w:rtl w:val="0"/>
+        </w:rPr>
+        <w:t xml:space="preserve">Role: </w:t>
+      </w:r>
+      <w:r>
+        <w:rPr>
+          <w:rFonts w:ascii="Times New Roman" w:cs="Times New Roman" w:eastAsia="Times New Roman" w:hAnsi="Times New Roman"/>
+          <w:rtl w:val="0"/>
+        </w:rPr>
+        <w:t xml:space="preserve">{{exp.position}}</w:t>
+      </w:r>
+    </w:p>
+    <w:p>
+      <w:pPr>
+        <w:spacing w:after="0" w:line="240" w:lineRule="auto"/>
+        <w:ind w:left="0" w:firstLine="0"/>
+        <w:jc w:val="both"/>
+        <w:rPr>
+          <w:rFonts w:ascii="Times New Roman" w:cs="Times New Roman" w:eastAsia="Times New Roman" w:hAnsi="Times New Roman"/>
+        </w:rPr>
+      </w:pPr>
+      <w:r>
+        <w:rPr>
+          <w:rFonts w:ascii="Times New Roman" w:cs="Times New Roman" w:eastAsia="Times New Roman" w:hAnsi="Times New Roman"/>
+          <w:b w:val="1"/>
+          <w:bCs w:val="1"/>
+          <w:rtl w:val="0"/>
+        </w:rPr>
+        <w:t xml:space="preserve">Responsibilities:</w:t>
+      </w:r>
+      <w:r>
+        <w:rPr>
+          <w:rtl w:val="0"/>
+        </w:rPr>
+      </w:r>
+    </w:p>
+    <w:p>
+      <w:pPr>
+        <w:spacing w:after="0" w:line="240" w:lineRule="auto"/>
+        <w:ind w:left="0" w:firstLine="0"/>
+        <w:jc w:val="both"/>
+        <w:rPr>
+          <w:rFonts w:ascii="Times New Roman" w:cs="Times New Roman" w:eastAsia="Times New Roman" w:hAnsi="Times New Roman"/>
+        </w:rPr>
+      </w:pPr>
+      <w:r>
+        <w:rPr>
+          <w:rFonts w:ascii="Times New Roman" w:cs="Times New Roman" w:eastAsia="Times New Roman" w:hAnsi="Times New Roman"/>
+          <w:rtl w:val="0"/>
+        </w:rPr>
+        <w:t xml:space="preserve">{%- for desc in exp.description %}</w:t>
+      </w:r>
+    </w:p>
+    <w:p>
+      <w:pPr>
+        <w:spacing w:after="0" w:line="240" w:lineRule="auto"/>
+        <w:ind w:left="0" w:firstLine="270"/>
+        <w:jc w:val="both"/>
+        <w:rPr>
+          <w:rFonts w:ascii="Times New Roman" w:cs="Times New Roman" w:eastAsia="Times New Roman" w:hAnsi="Times New Roman"/>
+        </w:rPr>
+      </w:pPr>
+      <w:r>
+        <w:rPr>
+          <w:rFonts w:ascii="Times New Roman" w:cs="Times New Roman" w:eastAsia="Times New Roman" w:hAnsi="Times New Roman"/>
+          <w:rtl w:val="0"/>
+        </w:rPr>
+        <w:t xml:space="preserve">• {{desc}}</w:t>
+      </w:r>
+    </w:p>
+    <w:p>
+      <w:pPr>
+        <w:spacing w:after="0" w:line="240" w:lineRule="auto"/>
+        <w:ind w:left="0" w:firstLine="0"/>
+        <w:jc w:val="both"/>
+        <w:rPr>
+          <w:rFonts w:ascii="Times New Roman" w:cs="Times New Roman" w:eastAsia="Times New Roman" w:hAnsi="Times New Roman"/>
+        </w:rPr>
+      </w:pPr>
+      <w:r>
+        <w:rPr>
+          <w:rFonts w:ascii="Times New Roman" w:cs="Times New Roman" w:eastAsia="Times New Roman" w:hAnsi="Times New Roman"/>
+          <w:rtl w:val="0"/>
+        </w:rPr>
+        <w:t xml:space="preserve">{%- endfor %}</w:t>
+      </w:r>
+    </w:p>
+    <w:p>
+      <w:pPr>
+        <w:spacing w:after="0" w:line="240" w:lineRule="auto"/>
+        <w:ind w:left="0" w:firstLine="0"/>
+        <w:jc w:val="both"/>
+        <w:rPr>
+          <w:rFonts w:ascii="Times New Roman" w:cs="Times New Roman" w:eastAsia="Times New Roman" w:hAnsi="Times New Roman"/>
+        </w:rPr>
+      </w:pPr>
+      <w:r>
+        <w:rPr>
+          <w:rFonts w:ascii="Times New Roman" w:cs="Times New Roman" w:eastAsia="Times New Roman" w:hAnsi="Times New Roman"/>
+          <w:rtl w:val="0"/>
+        </w:rPr>
+        <w:t xml:space="preserve">{%- endfor %}</w:t>
+      </w:r>
+    </w:p>
+    <w:p>
+      <w:pPr>
+        <w:spacing w:after="0" w:line="240" w:lineRule="auto"/>
+        <w:jc w:val="both"/>
+        <w:rPr>
+          <w:rFonts w:ascii="Times New Roman" w:cs="Times New Roman" w:eastAsia="Times New Roman" w:hAnsi="Times New Roman"/>
+          <w:b w:val="1"/>
+          <w:bCs w:val="1"/>
+        </w:rPr>
+      </w:pPr>
+      <w:r>
+        <w:rPr>
+          <w:rtl w:val="0"/>
+        </w:rPr>
+      </w:r>
+    </w:p>
+    <w:p>
+      <w:pPr>
+        <w:spacing w:after="0" w:line="240" w:lineRule="auto"/>
+        <w:jc w:val="both"/>
+        <w:rPr>
+          <w:rFonts w:ascii="Times New Roman" w:cs="Times New Roman" w:eastAsia="Times New Roman" w:hAnsi="Times New Roman"/>
+          <w:b w:val="1"/>
+          <w:bCs w:val="1"/>
+        </w:rPr>
+      </w:pPr>
       <w:r>
         <w:rPr>
           <w:rtl w:val="0"/>
@@ -427,257 +757,14 @@
           <w:smallCaps w:val="0"/>
           <w:strike w:val="0"/>
           <w:color w:val="000000"/>
-          <w:sz w:val="22"/>
-          <w:szCs w:val="22"/>
-          <w:u w:val="single"/>
+          <w:sz w:val="28"/>
+          <w:szCs w:val="28"/>
+          <w:u w:val="none"/>
           <w:shd w:fill="auto" w:val="clear"/>
           <w:vertAlign w:val="baseline"/>
         </w:rPr>
       </w:pPr>
       <w:r>
-        <w:rPr>
-          <w:rtl w:val="0"/>
-        </w:rPr>
-      </w:r>
-    </w:p>
-    <w:p>
-      <w:pPr>
-        <w:spacing w:after="0" w:line="240" w:lineRule="auto"/>
-        <w:ind w:left="0" w:firstLine="0"/>
-        <w:jc w:val="both"/>
-        <w:rPr>
-          <w:rFonts w:ascii="Times New Roman" w:cs="Times New Roman" w:eastAsia="Times New Roman" w:hAnsi="Times New Roman"/>
-        </w:rPr>
-      </w:pPr>
-      <w:r>
-        <w:rPr>
-          <w:rFonts w:ascii="Times New Roman" w:cs="Times New Roman" w:eastAsia="Times New Roman" w:hAnsi="Times New Roman"/>
-          <w:rtl w:val="0"/>
-        </w:rPr>
-        <w:t xml:space="preserve">{%- for exp in experience %}</w:t>
-      </w:r>
-    </w:p>
-    <w:p>
-      <w:pPr>
-        <w:spacing w:after="0" w:line="240" w:lineRule="auto"/>
-        <w:ind w:left="0" w:right="-600" w:firstLine="0"/>
-        <w:jc w:val="both"/>
-        <w:rPr>
-          <w:rFonts w:ascii="Times New Roman" w:cs="Times New Roman" w:eastAsia="Times New Roman" w:hAnsi="Times New Roman"/>
-          <w:b w:val="1"/>
-          <w:bCs w:val="1"/>
-        </w:rPr>
-      </w:pPr>
-      <w:r>
-        <w:rPr>
-          <w:rFonts w:ascii="Times New Roman" w:cs="Times New Roman" w:eastAsia="Times New Roman" w:hAnsi="Times New Roman"/>
-          <w:b w:val="1"/>
-          <w:bCs w:val="1"/>
-          <w:rtl w:val="0"/>
-        </w:rPr>
-        <w:t xml:space="preserve">Client: </w:t>
-      </w:r>
-      <w:r>
-        <w:rPr>
-          <w:rFonts w:ascii="Times New Roman" w:cs="Times New Roman" w:eastAsia="Times New Roman" w:hAnsi="Times New Roman"/>
-          <w:rtl w:val="0"/>
-        </w:rPr>
-        <w:t xml:space="preserve">{{exp.company}}                    </w:t>
-        <w:tab/>
-        <w:tab/>
-        <w:tab/>
-        <w:tab/>
-        <w:t xml:space="preserve">{{exp.start_date}}-{{exp.end_date}}</w:t>
-        <w:tab/>
-      </w:r>
-      <w:r>
-        <w:rPr>
-          <w:rtl w:val="0"/>
-        </w:rPr>
-      </w:r>
-    </w:p>
-    <w:p>
-      <w:pPr>
-        <w:spacing w:after="0" w:line="240" w:lineRule="auto"/>
-        <w:ind w:left="0" w:firstLine="0"/>
-        <w:jc w:val="both"/>
-        <w:rPr>
-          <w:rFonts w:ascii="Times New Roman" w:cs="Times New Roman" w:eastAsia="Times New Roman" w:hAnsi="Times New Roman"/>
-        </w:rPr>
-      </w:pPr>
-      <w:r>
-        <w:rPr>
-          <w:rFonts w:ascii="Times New Roman" w:cs="Times New Roman" w:eastAsia="Times New Roman" w:hAnsi="Times New Roman"/>
-          <w:b w:val="1"/>
-          <w:bCs w:val="1"/>
-          <w:rtl w:val="0"/>
-        </w:rPr>
-        <w:t xml:space="preserve">Role: </w:t>
-      </w:r>
-      <w:r>
-        <w:rPr>
-          <w:rFonts w:ascii="Times New Roman" w:cs="Times New Roman" w:eastAsia="Times New Roman" w:hAnsi="Times New Roman"/>
-          <w:rtl w:val="0"/>
-        </w:rPr>
-        <w:t xml:space="preserve">{{exp.position}}</w:t>
-      </w:r>
-    </w:p>
-    <w:p>
-      <w:pPr>
-        <w:spacing w:after="0" w:line="240" w:lineRule="auto"/>
-        <w:ind w:left="0" w:firstLine="0"/>
-        <w:jc w:val="both"/>
-        <w:rPr>
-          <w:rFonts w:ascii="Times New Roman" w:cs="Times New Roman" w:eastAsia="Times New Roman" w:hAnsi="Times New Roman"/>
-        </w:rPr>
-      </w:pPr>
-      <w:r>
-        <w:rPr>
-          <w:rFonts w:ascii="Times New Roman" w:cs="Times New Roman" w:eastAsia="Times New Roman" w:hAnsi="Times New Roman"/>
-          <w:b w:val="1"/>
-          <w:bCs w:val="1"/>
-          <w:rtl w:val="0"/>
-        </w:rPr>
-        <w:t xml:space="preserve">Responsibilities:</w:t>
-      </w:r>
-      <w:r>
-        <w:rPr>
-          <w:rtl w:val="0"/>
-        </w:rPr>
-      </w:r>
-    </w:p>
-    <w:p>
-      <w:pPr>
-        <w:spacing w:after="0" w:line="240" w:lineRule="auto"/>
-        <w:ind w:left="0" w:firstLine="0"/>
-        <w:jc w:val="both"/>
-        <w:rPr>
-          <w:rFonts w:ascii="Times New Roman" w:cs="Times New Roman" w:eastAsia="Times New Roman" w:hAnsi="Times New Roman"/>
-        </w:rPr>
-      </w:pPr>
-      <w:r>
-        <w:rPr>
-          <w:rFonts w:ascii="Times New Roman" w:cs="Times New Roman" w:eastAsia="Times New Roman" w:hAnsi="Times New Roman"/>
-          <w:rtl w:val="0"/>
-        </w:rPr>
-        <w:t xml:space="preserve">{%- for desc in exp.description %}</w:t>
-      </w:r>
-    </w:p>
-    <w:p>
-      <w:pPr>
-        <w:spacing w:after="0" w:line="240" w:lineRule="auto"/>
-        <w:ind w:left="0" w:firstLine="270"/>
-        <w:jc w:val="both"/>
-        <w:rPr>
-          <w:rFonts w:ascii="Times New Roman" w:cs="Times New Roman" w:eastAsia="Times New Roman" w:hAnsi="Times New Roman"/>
-        </w:rPr>
-      </w:pPr>
-      <w:r>
-        <w:rPr>
-          <w:rFonts w:ascii="Times New Roman" w:cs="Times New Roman" w:eastAsia="Times New Roman" w:hAnsi="Times New Roman"/>
-          <w:rtl w:val="0"/>
-        </w:rPr>
-        <w:t xml:space="preserve">• {{desc}}</w:t>
-      </w:r>
-    </w:p>
-    <w:p>
-      <w:pPr>
-        <w:spacing w:after="0" w:line="240" w:lineRule="auto"/>
-        <w:ind w:left="0" w:firstLine="0"/>
-        <w:jc w:val="both"/>
-        <w:rPr>
-          <w:rFonts w:ascii="Times New Roman" w:cs="Times New Roman" w:eastAsia="Times New Roman" w:hAnsi="Times New Roman"/>
-        </w:rPr>
-      </w:pPr>
-      <w:r>
-        <w:rPr>
-          <w:rFonts w:ascii="Times New Roman" w:cs="Times New Roman" w:eastAsia="Times New Roman" w:hAnsi="Times New Roman"/>
-          <w:rtl w:val="0"/>
-        </w:rPr>
-        <w:t xml:space="preserve">{%- endfor %}</w:t>
-      </w:r>
-    </w:p>
-    <w:p>
-      <w:pPr>
-        <w:spacing w:after="0" w:line="240" w:lineRule="auto"/>
-        <w:ind w:left="0" w:firstLine="0"/>
-        <w:jc w:val="both"/>
-        <w:rPr>
-          <w:rFonts w:ascii="Times New Roman" w:cs="Times New Roman" w:eastAsia="Times New Roman" w:hAnsi="Times New Roman"/>
-        </w:rPr>
-      </w:pPr>
-      <w:r>
-        <w:rPr>
-          <w:rtl w:val="0"/>
-        </w:rPr>
-      </w:r>
-    </w:p>
-    <w:p>
-      <w:pPr>
-        <w:spacing w:after="0" w:line="240" w:lineRule="auto"/>
-        <w:ind w:left="0" w:firstLine="0"/>
-        <w:jc w:val="both"/>
-        <w:rPr>
-          <w:rFonts w:ascii="Times New Roman" w:cs="Times New Roman" w:eastAsia="Times New Roman" w:hAnsi="Times New Roman"/>
-        </w:rPr>
-      </w:pPr>
-      <w:r>
-        <w:rPr>
-          <w:rFonts w:ascii="Times New Roman" w:cs="Times New Roman" w:eastAsia="Times New Roman" w:hAnsi="Times New Roman"/>
-          <w:rtl w:val="0"/>
-        </w:rPr>
-        <w:t xml:space="preserve">{%- endfor %}</w:t>
-      </w:r>
-    </w:p>
-    <w:p>
-      <w:pPr>
-        <w:spacing w:after="0" w:line="240" w:lineRule="auto"/>
-        <w:jc w:val="both"/>
-        <w:rPr>
-          <w:rFonts w:ascii="Times New Roman" w:cs="Times New Roman" w:eastAsia="Times New Roman" w:hAnsi="Times New Roman"/>
-          <w:b w:val="1"/>
-          <w:bCs w:val="1"/>
-        </w:rPr>
-      </w:pPr>
-      <w:r>
-        <w:rPr>
-          <w:rtl w:val="0"/>
-        </w:rPr>
-      </w:r>
-    </w:p>
-    <w:p>
-      <w:pPr>
-        <w:spacing w:after="0" w:line="240" w:lineRule="auto"/>
-        <w:jc w:val="both"/>
-        <w:rPr>
-          <w:rFonts w:ascii="Times New Roman" w:cs="Times New Roman" w:eastAsia="Times New Roman" w:hAnsi="Times New Roman"/>
-          <w:b w:val="1"/>
-          <w:bCs w:val="1"/>
-        </w:rPr>
-      </w:pPr>
-      <w:r>
-        <w:rPr>
-          <w:rtl w:val="0"/>
-        </w:rPr>
-      </w:r>
-    </w:p>
-    <w:p>
-      <w:pPr>
-        <w:keepNext w:val="0"/>
-        <w:keepLines w:val="0"/>
-        <w:pageBreakBefore w:val="0"/>
-        <w:widowControl w:val="1"/>
-        <w:pBdr>
-          <w:top w:space="0" w:sz="0" w:val="nil"/>
-          <w:left w:space="0" w:sz="0" w:val="nil"/>
-          <w:bottom w:space="0" w:sz="0" w:val="nil"/>
-          <w:right w:space="0" w:sz="0" w:val="nil"/>
-          <w:between w:space="0" w:sz="0" w:val="nil"/>
-        </w:pBdr>
-        <w:shd w:fill="auto" w:val="clear"/>
-        <w:spacing w:after="0" w:before="0" w:line="240" w:lineRule="auto"/>
-        <w:ind w:left="360" w:right="0" w:hanging="360"/>
-        <w:jc w:val="left"/>
         <w:rPr>
           <w:rFonts w:ascii="Times New Roman" w:cs="Times New Roman" w:eastAsia="Times New Roman" w:hAnsi="Times New Roman"/>
           <w:b w:val="1"/>
@@ -692,23 +779,6 @@
           <w:u w:val="none"/>
           <w:shd w:fill="auto" w:val="clear"/>
           <w:vertAlign w:val="baseline"/>
-        </w:rPr>
-      </w:pPr>
-      <w:r>
-        <w:rPr>
-          <w:rFonts w:ascii="Times New Roman" w:cs="Times New Roman" w:eastAsia="Times New Roman" w:hAnsi="Times New Roman"/>
-          <w:b w:val="1"/>
-          <w:bCs w:val="1"/>
-          <w:i w:val="0"/>
-          <w:iCs w:val="0"/>
-          <w:smallCaps w:val="0"/>
-          <w:strike w:val="0"/>
-          <w:color w:val="000000"/>
-          <w:sz w:val="28"/>
-          <w:szCs w:val="28"/>
-          <w:u w:val="none"/>
-          <w:shd w:fill="auto" w:val="clear"/>
-          <w:vertAlign w:val="baseline"/>
           <w:rtl w:val="0"/>
         </w:rPr>
         <w:t xml:space="preserve">Education:</w:t>
@@ -757,6 +827,25 @@
           <w:rtl w:val="0"/>
         </w:rPr>
         <w:t xml:space="preserve">{%- for edu in education %}</w:t>
+      </w:r>
+    </w:p>
+    <w:p>
+      <w:pPr>
+        <w:spacing w:after="0" w:line="240" w:lineRule="auto"/>
+        <w:jc w:val="both"/>
+        <w:rPr>
+          <w:rFonts w:ascii="Times New Roman" w:cs="Times New Roman" w:eastAsia="Times New Roman" w:hAnsi="Times New Roman"/>
+          <w:sz w:val="28"/>
+          <w:szCs w:val="28"/>
+          <w:u w:val="single"/>
+        </w:rPr>
+      </w:pPr>
+      <w:bookmarkStart w:colFirst="0" w:colLast="0" w:name="_heading=h.pzj64ouzpb1a" w:id="2"/>
+      <w:bookmarkEnd w:id="2"/>
+      <w:r>
+        <w:rPr>
+          <w:rtl w:val="0"/>
+        </w:rPr>
       </w:r>
     </w:p>
     <w:p>
@@ -1120,6 +1209,34 @@
       <w:sz w:val="72"/>
       <w:szCs w:val="72"/>
     </w:rPr>
+  </w:style>
+  <w:style w:type="table" w:styleId="TableNormal" w:default="1">
+    <w:name w:val="TableNormal"/>
+    <w:tblPr>
+      <w:tblCellMar>
+        <w:top w:w="100.0" w:type="dxa"/>
+        <w:left w:w="100.0" w:type="dxa"/>
+        <w:bottom w:w="100.0" w:type="dxa"/>
+        <w:right w:w="100.0" w:type="dxa"/>
+      </w:tblCellMar>
+    </w:tblPr>
+  </w:style>
+  <w:style w:type="paragraph" w:styleId="Normal" w:default="1">
+    <w:name w:val="normal"/>
+  </w:style>
+  <w:style w:type="table" w:styleId="TableNormal" w:default="1">
+    <w:name w:val="TableNormal"/>
+    <w:tblPr>
+      <w:tblCellMar>
+        <w:top w:w="100.0" w:type="dxa"/>
+        <w:left w:w="100.0" w:type="dxa"/>
+        <w:bottom w:w="100.0" w:type="dxa"/>
+        <w:right w:w="100.0" w:type="dxa"/>
+      </w:tblCellMar>
+    </w:tblPr>
+  </w:style>
+  <w:style w:type="paragraph" w:styleId="Normal" w:default="1">
+    <w:name w:val="normal"/>
   </w:style>
   <w:style w:type="table" w:styleId="TableNormal" w:default="1">
     <w:name w:val="TableNormal"/>
@@ -1708,7 +1825,7 @@
 
 <file path=customXML/item1.xml><?xml version="1.0" encoding="utf-8"?>
 <go:gDocsCustomXmlDataStorage xmlns:go="http://customooxmlschemas.google.com/" xmlns:r="http://schemas.openxmlformats.org/officeDocument/2006/relationships" uri="GoogleDocsCustomDataVersion2">
-  <go:docsCustomData xmlns:go="http://customooxmlschemas.google.com/" roundtripDataSignature="AMtx7mh8l0fS/OXQ85L/RCKyxKJQKZRb0A==">CgMxLjAyDmgueHIzdG9pY2N2M3VzMg5oLmZlOTJpMDN0bTBwajgAciExUTh0NEI5MXc3bUdFQWdnQTRuWjRad2xmRWhJRTBrNWg=</go:docsCustomData>
+  <go:docsCustomData xmlns:go="http://customooxmlschemas.google.com/" roundtripDataSignature="AMtx7midT13POepGZZuoJ36nGo9Fs5Hn5g==">CgMxLjAyDmgueHIzdG9pY2N2M3VzMg5oLmZlOTJpMDN0bTBwajIOaC5wemo2NG91enBiMWE4AHIhMWF2aEhmeXFZdlA1OUp0SkV4S3FmcExGeVdHMTRoaE9C</go:docsCustomData>
 </go:gDocsCustomXmlDataStorage>
 </file>
 

</xml_diff>